<commit_message>
some bug fixes with Field Definition
</commit_message>
<xml_diff>
--- a/assets/project_template.docx
+++ b/assets/project_template.docx
@@ -2966,7 +2966,7 @@
     </w:p>
     <w:tbl>
       <w:tblPr>
-        <w:tblW w:w="9913" w:type="dxa"/>
+        <w:tblW w:w="5000" w:type="pct"/>
         <w:tblBorders>
           <w:top w:val="single" w:sz="4" w:space="0" w:color="auto"/>
           <w:left w:val="single" w:sz="4" w:space="0" w:color="auto"/>
@@ -2975,7 +2975,6 @@
           <w:insideH w:val="single" w:sz="4" w:space="0" w:color="auto"/>
           <w:insideV w:val="single" w:sz="4" w:space="0" w:color="auto"/>
         </w:tblBorders>
-        <w:tblLayout w:type="fixed"/>
         <w:tblCellMar>
           <w:left w:w="10" w:type="dxa"/>
           <w:right w:w="10" w:type="dxa"/>
@@ -2983,12 +2982,19 @@
         <w:tblLook w:val="0000" w:firstRow="0" w:lastRow="0" w:firstColumn="0" w:lastColumn="0" w:noHBand="0" w:noVBand="0"/>
       </w:tblPr>
       <w:tblGrid>
-        <w:gridCol w:w="40"/>
-        <w:gridCol w:w="2365"/>
-        <w:gridCol w:w="2268"/>
-        <w:gridCol w:w="1484"/>
-        <w:gridCol w:w="1878"/>
-        <w:gridCol w:w="1878"/>
+        <w:gridCol w:w="134"/>
+        <w:gridCol w:w="24"/>
+        <w:gridCol w:w="1509"/>
+        <w:gridCol w:w="1985"/>
+        <w:gridCol w:w="1151"/>
+        <w:gridCol w:w="28"/>
+        <w:gridCol w:w="27"/>
+        <w:gridCol w:w="35"/>
+        <w:gridCol w:w="27"/>
+        <w:gridCol w:w="128"/>
+        <w:gridCol w:w="1668"/>
+        <w:gridCol w:w="1589"/>
+        <w:gridCol w:w="1589"/>
       </w:tblGrid>
       <w:tr>
         <w:trPr>
@@ -2996,7 +3002,7 @@
         </w:trPr>
         <w:tc>
           <w:tcPr>
-            <w:tcW w:w="40" w:type="dxa"/>
+            <w:tcW w:w="68" w:type="pct"/>
             <w:tcBorders>
               <w:top w:val="single" w:sz="4" w:space="0" w:color="FFFFFF" w:themeColor="background1"/>
               <w:left w:val="single" w:sz="4" w:space="0" w:color="FFFFFF" w:themeColor="background1"/>
@@ -3018,7 +3024,7 @@
         </w:tc>
         <w:tc>
           <w:tcPr>
-            <w:tcW w:w="2365" w:type="dxa"/>
+            <w:tcW w:w="12" w:type="pct"/>
             <w:tcBorders>
               <w:top w:val="single" w:sz="1" w:space="0" w:color="BFBFBF"/>
               <w:left w:val="single" w:sz="1" w:space="0" w:color="BFBFBF"/>
@@ -3026,15 +3032,9 @@
               <w:right w:val="single" w:sz="1" w:space="0" w:color="BFBFBF"/>
             </w:tcBorders>
             <w:shd w:val="clear" w:color="auto" w:fill="1F4E79"/>
-            <w:tcMar>
-              <w:top w:w="70" w:type="dxa"/>
-              <w:left w:w="120" w:type="dxa"/>
-              <w:bottom w:w="70" w:type="dxa"/>
-              <w:right w:w="120" w:type="dxa"/>
-            </w:tcMar>
-          </w:tcPr>
-          <w:p>
-            <w:r>
+          </w:tcPr>
+          <w:p>
+            <w:pPr>
               <w:rPr>
                 <w:b/>
                 <w:bCs/>
@@ -3042,13 +3042,12 @@
                 <w:sz w:val="18"/>
                 <w:szCs w:val="18"/>
               </w:rPr>
-              <w:t>Field</w:t>
-            </w:r>
-          </w:p>
-        </w:tc>
-        <w:tc>
-          <w:tcPr>
-            <w:tcW w:w="2268" w:type="dxa"/>
+            </w:pPr>
+          </w:p>
+        </w:tc>
+        <w:tc>
+          <w:tcPr>
+            <w:tcW w:w="763" w:type="pct"/>
             <w:tcBorders>
               <w:top w:val="single" w:sz="1" w:space="0" w:color="BFBFBF"/>
               <w:left w:val="single" w:sz="1" w:space="0" w:color="BFBFBF"/>
@@ -3072,13 +3071,13 @@
                 <w:sz w:val="18"/>
                 <w:szCs w:val="18"/>
               </w:rPr>
-              <w:t>Type</w:t>
-            </w:r>
-          </w:p>
-        </w:tc>
-        <w:tc>
-          <w:tcPr>
-            <w:tcW w:w="1484" w:type="dxa"/>
+              <w:t>Field</w:t>
+            </w:r>
+          </w:p>
+        </w:tc>
+        <w:tc>
+          <w:tcPr>
+            <w:tcW w:w="301" w:type="pct"/>
             <w:tcBorders>
               <w:top w:val="single" w:sz="1" w:space="0" w:color="BFBFBF"/>
               <w:left w:val="single" w:sz="1" w:space="0" w:color="BFBFBF"/>
@@ -3102,9 +3101,24 @@
                 <w:sz w:val="18"/>
                 <w:szCs w:val="18"/>
               </w:rPr>
-              <w:t>L</w:t>
-            </w:r>
-            <w:r>
+              <w:t>Type</w:t>
+            </w:r>
+          </w:p>
+        </w:tc>
+        <w:tc>
+          <w:tcPr>
+            <w:tcW w:w="1407" w:type="pct"/>
+            <w:gridSpan w:val="6"/>
+            <w:tcBorders>
+              <w:top w:val="single" w:sz="1" w:space="0" w:color="BFBFBF"/>
+              <w:left w:val="single" w:sz="1" w:space="0" w:color="BFBFBF"/>
+              <w:bottom w:val="single" w:sz="1" w:space="0" w:color="BFBFBF"/>
+              <w:right w:val="single" w:sz="1" w:space="0" w:color="BFBFBF"/>
+            </w:tcBorders>
+            <w:shd w:val="clear" w:color="auto" w:fill="1F4E79"/>
+          </w:tcPr>
+          <w:p>
+            <w:pPr>
               <w:rPr>
                 <w:b/>
                 <w:bCs/>
@@ -3112,28 +3126,7 @@
                 <w:sz w:val="18"/>
                 <w:szCs w:val="18"/>
               </w:rPr>
-              <w:t>ength</w:t>
-            </w:r>
-          </w:p>
-        </w:tc>
-        <w:tc>
-          <w:tcPr>
-            <w:tcW w:w="1878" w:type="dxa"/>
-            <w:tcBorders>
-              <w:top w:val="single" w:sz="1" w:space="0" w:color="BFBFBF"/>
-              <w:left w:val="single" w:sz="1" w:space="0" w:color="BFBFBF"/>
-              <w:bottom w:val="single" w:sz="1" w:space="0" w:color="BFBFBF"/>
-              <w:right w:val="single" w:sz="1" w:space="0" w:color="BFBFBF"/>
-            </w:tcBorders>
-            <w:shd w:val="clear" w:color="auto" w:fill="1F4E79"/>
-            <w:tcMar>
-              <w:top w:w="70" w:type="dxa"/>
-              <w:left w:w="120" w:type="dxa"/>
-              <w:bottom w:w="70" w:type="dxa"/>
-              <w:right w:w="120" w:type="dxa"/>
-            </w:tcMar>
-          </w:tcPr>
-          <w:p>
+            </w:pPr>
             <w:r>
               <w:rPr>
                 <w:b/>
@@ -3148,7 +3141,7 @@
         </w:tc>
         <w:tc>
           <w:tcPr>
-            <w:tcW w:w="1878" w:type="dxa"/>
+            <w:tcW w:w="843" w:type="pct"/>
             <w:tcBorders>
               <w:top w:val="single" w:sz="1" w:space="0" w:color="BFBFBF"/>
               <w:left w:val="single" w:sz="1" w:space="0" w:color="BFBFBF"/>
@@ -3172,6 +3165,76 @@
                 <w:sz w:val="18"/>
                 <w:szCs w:val="18"/>
               </w:rPr>
+              <w:t>L</w:t>
+            </w:r>
+            <w:r>
+              <w:rPr>
+                <w:b/>
+                <w:bCs/>
+                <w:color w:val="FFFFFF"/>
+                <w:sz w:val="18"/>
+                <w:szCs w:val="18"/>
+              </w:rPr>
+              <w:t>ength</w:t>
+            </w:r>
+          </w:p>
+        </w:tc>
+        <w:tc>
+          <w:tcPr>
+            <w:tcW w:w="803" w:type="pct"/>
+            <w:tcBorders>
+              <w:top w:val="single" w:sz="1" w:space="0" w:color="BFBFBF"/>
+              <w:left w:val="single" w:sz="1" w:space="0" w:color="BFBFBF"/>
+              <w:bottom w:val="single" w:sz="1" w:space="0" w:color="BFBFBF"/>
+              <w:right w:val="single" w:sz="1" w:space="0" w:color="BFBFBF"/>
+            </w:tcBorders>
+            <w:shd w:val="clear" w:color="auto" w:fill="1F4E79"/>
+            <w:tcMar>
+              <w:top w:w="70" w:type="dxa"/>
+              <w:left w:w="120" w:type="dxa"/>
+              <w:bottom w:w="70" w:type="dxa"/>
+              <w:right w:w="120" w:type="dxa"/>
+            </w:tcMar>
+          </w:tcPr>
+          <w:p>
+            <w:r>
+              <w:rPr>
+                <w:b/>
+                <w:bCs/>
+                <w:color w:val="FFFFFF"/>
+                <w:sz w:val="18"/>
+                <w:szCs w:val="18"/>
+              </w:rPr>
+              <w:t>Flags</w:t>
+            </w:r>
+          </w:p>
+        </w:tc>
+        <w:tc>
+          <w:tcPr>
+            <w:tcW w:w="803" w:type="pct"/>
+            <w:tcBorders>
+              <w:top w:val="single" w:sz="1" w:space="0" w:color="BFBFBF"/>
+              <w:left w:val="single" w:sz="1" w:space="0" w:color="BFBFBF"/>
+              <w:bottom w:val="single" w:sz="1" w:space="0" w:color="BFBFBF"/>
+              <w:right w:val="single" w:sz="1" w:space="0" w:color="BFBFBF"/>
+            </w:tcBorders>
+            <w:shd w:val="clear" w:color="auto" w:fill="1F4E79"/>
+            <w:tcMar>
+              <w:top w:w="70" w:type="dxa"/>
+              <w:left w:w="120" w:type="dxa"/>
+              <w:bottom w:w="70" w:type="dxa"/>
+              <w:right w:w="120" w:type="dxa"/>
+            </w:tcMar>
+          </w:tcPr>
+          <w:p>
+            <w:r>
+              <w:rPr>
+                <w:b/>
+                <w:bCs/>
+                <w:color w:val="FFFFFF"/>
+                <w:sz w:val="18"/>
+                <w:szCs w:val="18"/>
+              </w:rPr>
               <w:t>Label</w:t>
             </w:r>
           </w:p>
@@ -3180,7 +3243,7 @@
       <w:tr>
         <w:tc>
           <w:tcPr>
-            <w:tcW w:w="40" w:type="dxa"/>
+            <w:tcW w:w="68" w:type="pct"/>
             <w:tcBorders>
               <w:top w:val="single" w:sz="4" w:space="0" w:color="FFFFFF" w:themeColor="background1"/>
               <w:left w:val="single" w:sz="4" w:space="0" w:color="FFFFFF" w:themeColor="background1"/>
@@ -3210,13 +3273,34 @@
         </w:tc>
         <w:tc>
           <w:tcPr>
-            <w:tcW w:w="2365" w:type="dxa"/>
+            <w:tcW w:w="12" w:type="pct"/>
             <w:tcBorders>
               <w:top w:val="single" w:sz="1" w:space="0" w:color="BFBFBF"/>
               <w:left w:val="single" w:sz="1" w:space="0" w:color="BFBFBF"/>
               <w:bottom w:val="single" w:sz="4" w:space="0" w:color="BFBFBF"/>
               <w:right w:val="single" w:sz="1" w:space="0" w:color="BFBFBF"/>
             </w:tcBorders>
+          </w:tcPr>
+          <w:p>
+            <w:pPr>
+              <w:rPr>
+                <w:rFonts w:ascii="Courier New" w:eastAsia="Courier New" w:hAnsi="Courier New" w:cs="Courier New"/>
+                <w:color w:val="595959"/>
+                <w:sz w:val="18"/>
+                <w:szCs w:val="18"/>
+              </w:rPr>
+            </w:pPr>
+          </w:p>
+        </w:tc>
+        <w:tc>
+          <w:tcPr>
+            <w:tcW w:w="763" w:type="pct"/>
+            <w:tcBorders>
+              <w:top w:val="single" w:sz="1" w:space="0" w:color="BFBFBF"/>
+              <w:left w:val="single" w:sz="1" w:space="0" w:color="BFBFBF"/>
+              <w:bottom w:val="single" w:sz="4" w:space="0" w:color="BFBFBF"/>
+              <w:right w:val="single" w:sz="1" w:space="0" w:color="BFBFBF"/>
+            </w:tcBorders>
             <w:tcMar>
               <w:top w:w="70" w:type="dxa"/>
               <w:left w:w="120" w:type="dxa"/>
@@ -3238,7 +3322,7 @@
         </w:tc>
         <w:tc>
           <w:tcPr>
-            <w:tcW w:w="2268" w:type="dxa"/>
+            <w:tcW w:w="301" w:type="pct"/>
             <w:tcBorders>
               <w:top w:val="single" w:sz="1" w:space="0" w:color="BFBFBF"/>
               <w:left w:val="single" w:sz="1" w:space="0" w:color="BFBFBF"/>
@@ -3266,13 +3350,44 @@
         </w:tc>
         <w:tc>
           <w:tcPr>
-            <w:tcW w:w="1484" w:type="dxa"/>
+            <w:tcW w:w="1407" w:type="pct"/>
+            <w:gridSpan w:val="6"/>
             <w:tcBorders>
               <w:top w:val="single" w:sz="1" w:space="0" w:color="BFBFBF"/>
               <w:left w:val="single" w:sz="1" w:space="0" w:color="BFBFBF"/>
               <w:bottom w:val="single" w:sz="4" w:space="0" w:color="BFBFBF"/>
               <w:right w:val="single" w:sz="1" w:space="0" w:color="BFBFBF"/>
             </w:tcBorders>
+          </w:tcPr>
+          <w:p>
+            <w:pPr>
+              <w:rPr>
+                <w:rFonts w:ascii="Courier New" w:eastAsia="Courier New" w:hAnsi="Courier New" w:cs="Courier New"/>
+                <w:color w:val="595959"/>
+                <w:sz w:val="18"/>
+                <w:szCs w:val="18"/>
+              </w:rPr>
+            </w:pPr>
+            <w:r>
+              <w:rPr>
+                <w:rFonts w:ascii="Courier New" w:eastAsia="Courier New" w:hAnsi="Courier New" w:cs="Courier New"/>
+                <w:color w:val="595959"/>
+                <w:sz w:val="18"/>
+                <w:szCs w:val="18"/>
+              </w:rPr>
+              <w:t>{{ field.flags }}</w:t>
+            </w:r>
+          </w:p>
+        </w:tc>
+        <w:tc>
+          <w:tcPr>
+            <w:tcW w:w="843" w:type="pct"/>
+            <w:tcBorders>
+              <w:top w:val="single" w:sz="1" w:space="0" w:color="BFBFBF"/>
+              <w:left w:val="single" w:sz="1" w:space="0" w:color="BFBFBF"/>
+              <w:bottom w:val="single" w:sz="4" w:space="0" w:color="BFBFBF"/>
+              <w:right w:val="single" w:sz="1" w:space="0" w:color="BFBFBF"/>
+            </w:tcBorders>
             <w:tcMar>
               <w:top w:w="70" w:type="dxa"/>
               <w:left w:w="120" w:type="dxa"/>
@@ -3294,7 +3409,7 @@
         </w:tc>
         <w:tc>
           <w:tcPr>
-            <w:tcW w:w="1878" w:type="dxa"/>
+            <w:tcW w:w="803" w:type="pct"/>
             <w:tcBorders>
               <w:top w:val="single" w:sz="1" w:space="0" w:color="BFBFBF"/>
               <w:left w:val="single" w:sz="1" w:space="0" w:color="BFBFBF"/>
@@ -3322,7 +3437,7 @@
         </w:tc>
         <w:tc>
           <w:tcPr>
-            <w:tcW w:w="1878" w:type="dxa"/>
+            <w:tcW w:w="803" w:type="pct"/>
             <w:tcBorders>
               <w:top w:val="single" w:sz="1" w:space="0" w:color="BFBFBF"/>
               <w:left w:val="single" w:sz="1" w:space="0" w:color="BFBFBF"/>
@@ -3360,7 +3475,7 @@
       <w:tr>
         <w:tc>
           <w:tcPr>
-            <w:tcW w:w="40" w:type="dxa"/>
+            <w:tcW w:w="68" w:type="pct"/>
             <w:tcBorders>
               <w:top w:val="single" w:sz="4" w:space="0" w:color="FFFFFF" w:themeColor="background1"/>
               <w:left w:val="nil"/>
@@ -3390,19 +3505,13 @@
         </w:tc>
         <w:tc>
           <w:tcPr>
-            <w:tcW w:w="2365" w:type="dxa"/>
+            <w:tcW w:w="12" w:type="pct"/>
             <w:tcBorders>
               <w:top w:val="single" w:sz="4" w:space="0" w:color="BFBFBF"/>
               <w:left w:val="nil"/>
               <w:bottom w:val="nil"/>
               <w:right w:val="nil"/>
             </w:tcBorders>
-            <w:tcMar>
-              <w:top w:w="70" w:type="dxa"/>
-              <w:left w:w="120" w:type="dxa"/>
-              <w:bottom w:w="70" w:type="dxa"/>
-              <w:right w:w="120" w:type="dxa"/>
-            </w:tcMar>
           </w:tcPr>
           <w:p>
             <w:pPr>
@@ -3417,7 +3526,7 @@
         </w:tc>
         <w:tc>
           <w:tcPr>
-            <w:tcW w:w="2268" w:type="dxa"/>
+            <w:tcW w:w="763" w:type="pct"/>
             <w:tcBorders>
               <w:top w:val="single" w:sz="4" w:space="0" w:color="BFBFBF"/>
               <w:left w:val="nil"/>
@@ -3444,7 +3553,7 @@
         </w:tc>
         <w:tc>
           <w:tcPr>
-            <w:tcW w:w="1484" w:type="dxa"/>
+            <w:tcW w:w="301" w:type="pct"/>
             <w:tcBorders>
               <w:top w:val="single" w:sz="4" w:space="0" w:color="BFBFBF"/>
               <w:left w:val="nil"/>
@@ -3471,19 +3580,13 @@
         </w:tc>
         <w:tc>
           <w:tcPr>
-            <w:tcW w:w="1878" w:type="dxa"/>
+            <w:tcW w:w="1182" w:type="pct"/>
             <w:tcBorders>
               <w:top w:val="single" w:sz="4" w:space="0" w:color="BFBFBF"/>
               <w:left w:val="nil"/>
               <w:bottom w:val="nil"/>
               <w:right w:val="nil"/>
             </w:tcBorders>
-            <w:tcMar>
-              <w:top w:w="70" w:type="dxa"/>
-              <w:left w:w="120" w:type="dxa"/>
-              <w:bottom w:w="70" w:type="dxa"/>
-              <w:right w:w="120" w:type="dxa"/>
-            </w:tcMar>
           </w:tcPr>
           <w:p>
             <w:pPr>
@@ -3498,7 +3601,166 @@
         </w:tc>
         <w:tc>
           <w:tcPr>
-            <w:tcW w:w="1878" w:type="dxa"/>
+            <w:tcW w:w="23" w:type="pct"/>
+            <w:tcBorders>
+              <w:top w:val="single" w:sz="4" w:space="0" w:color="BFBFBF"/>
+              <w:left w:val="nil"/>
+              <w:bottom w:val="nil"/>
+              <w:right w:val="nil"/>
+            </w:tcBorders>
+          </w:tcPr>
+          <w:p>
+            <w:pPr>
+              <w:rPr>
+                <w:rFonts w:ascii="Courier New" w:eastAsia="Courier New" w:hAnsi="Courier New" w:cs="Courier New"/>
+                <w:color w:val="595959"/>
+                <w:sz w:val="18"/>
+                <w:szCs w:val="18"/>
+              </w:rPr>
+            </w:pPr>
+          </w:p>
+        </w:tc>
+        <w:tc>
+          <w:tcPr>
+            <w:tcW w:w="22" w:type="pct"/>
+            <w:tcBorders>
+              <w:top w:val="single" w:sz="4" w:space="0" w:color="BFBFBF"/>
+              <w:left w:val="nil"/>
+              <w:bottom w:val="nil"/>
+              <w:right w:val="nil"/>
+            </w:tcBorders>
+          </w:tcPr>
+          <w:p>
+            <w:pPr>
+              <w:rPr>
+                <w:rFonts w:ascii="Courier New" w:eastAsia="Courier New" w:hAnsi="Courier New" w:cs="Courier New"/>
+                <w:color w:val="595959"/>
+                <w:sz w:val="18"/>
+                <w:szCs w:val="18"/>
+              </w:rPr>
+            </w:pPr>
+          </w:p>
+        </w:tc>
+        <w:tc>
+          <w:tcPr>
+            <w:tcW w:w="31" w:type="pct"/>
+            <w:tcBorders>
+              <w:top w:val="single" w:sz="4" w:space="0" w:color="BFBFBF"/>
+              <w:left w:val="nil"/>
+              <w:bottom w:val="nil"/>
+              <w:right w:val="nil"/>
+            </w:tcBorders>
+          </w:tcPr>
+          <w:p>
+            <w:pPr>
+              <w:rPr>
+                <w:rFonts w:ascii="Courier New" w:eastAsia="Courier New" w:hAnsi="Courier New" w:cs="Courier New"/>
+                <w:color w:val="595959"/>
+                <w:sz w:val="18"/>
+                <w:szCs w:val="18"/>
+              </w:rPr>
+            </w:pPr>
+          </w:p>
+        </w:tc>
+        <w:tc>
+          <w:tcPr>
+            <w:tcW w:w="22" w:type="pct"/>
+            <w:tcBorders>
+              <w:top w:val="single" w:sz="4" w:space="0" w:color="BFBFBF"/>
+              <w:left w:val="nil"/>
+              <w:bottom w:val="nil"/>
+              <w:right w:val="nil"/>
+            </w:tcBorders>
+          </w:tcPr>
+          <w:p>
+            <w:pPr>
+              <w:rPr>
+                <w:rFonts w:ascii="Courier New" w:eastAsia="Courier New" w:hAnsi="Courier New" w:cs="Courier New"/>
+                <w:color w:val="595959"/>
+                <w:sz w:val="18"/>
+                <w:szCs w:val="18"/>
+              </w:rPr>
+            </w:pPr>
+          </w:p>
+        </w:tc>
+        <w:tc>
+          <w:tcPr>
+            <w:tcW w:w="127" w:type="pct"/>
+            <w:tcBorders>
+              <w:top w:val="single" w:sz="4" w:space="0" w:color="BFBFBF"/>
+              <w:left w:val="nil"/>
+              <w:bottom w:val="nil"/>
+              <w:right w:val="nil"/>
+            </w:tcBorders>
+          </w:tcPr>
+          <w:p>
+            <w:pPr>
+              <w:rPr>
+                <w:rFonts w:ascii="Courier New" w:eastAsia="Courier New" w:hAnsi="Courier New" w:cs="Courier New"/>
+                <w:color w:val="595959"/>
+                <w:sz w:val="18"/>
+                <w:szCs w:val="18"/>
+              </w:rPr>
+            </w:pPr>
+          </w:p>
+        </w:tc>
+        <w:tc>
+          <w:tcPr>
+            <w:tcW w:w="843" w:type="pct"/>
+            <w:tcBorders>
+              <w:top w:val="single" w:sz="4" w:space="0" w:color="BFBFBF"/>
+              <w:left w:val="nil"/>
+              <w:bottom w:val="nil"/>
+              <w:right w:val="nil"/>
+            </w:tcBorders>
+            <w:tcMar>
+              <w:top w:w="70" w:type="dxa"/>
+              <w:left w:w="120" w:type="dxa"/>
+              <w:bottom w:w="70" w:type="dxa"/>
+              <w:right w:w="120" w:type="dxa"/>
+            </w:tcMar>
+          </w:tcPr>
+          <w:p>
+            <w:pPr>
+              <w:rPr>
+                <w:rFonts w:ascii="Courier New" w:eastAsia="Courier New" w:hAnsi="Courier New" w:cs="Courier New"/>
+                <w:color w:val="595959"/>
+                <w:sz w:val="18"/>
+                <w:szCs w:val="18"/>
+              </w:rPr>
+            </w:pPr>
+          </w:p>
+        </w:tc>
+        <w:tc>
+          <w:tcPr>
+            <w:tcW w:w="803" w:type="pct"/>
+            <w:tcBorders>
+              <w:top w:val="single" w:sz="4" w:space="0" w:color="BFBFBF"/>
+              <w:left w:val="nil"/>
+              <w:bottom w:val="nil"/>
+              <w:right w:val="nil"/>
+            </w:tcBorders>
+            <w:tcMar>
+              <w:top w:w="70" w:type="dxa"/>
+              <w:left w:w="120" w:type="dxa"/>
+              <w:bottom w:w="70" w:type="dxa"/>
+              <w:right w:w="120" w:type="dxa"/>
+            </w:tcMar>
+          </w:tcPr>
+          <w:p>
+            <w:pPr>
+              <w:rPr>
+                <w:rFonts w:ascii="Courier New" w:eastAsia="Courier New" w:hAnsi="Courier New" w:cs="Courier New"/>
+                <w:color w:val="595959"/>
+                <w:sz w:val="18"/>
+                <w:szCs w:val="18"/>
+              </w:rPr>
+            </w:pPr>
+          </w:p>
+        </w:tc>
+        <w:tc>
+          <w:tcPr>
+            <w:tcW w:w="803" w:type="pct"/>
             <w:tcBorders>
               <w:top w:val="single" w:sz="4" w:space="0" w:color="BFBFBF"/>
               <w:left w:val="nil"/>

</xml_diff>

<commit_message>
Added fixRootTag() to add <root> to XML, rename helper functions, update template
Co-authored-by: Copilot <copilot@github.com>
</commit_message>
<xml_diff>
--- a/assets/project_template.docx
+++ b/assets/project_template.docx
@@ -2982,19 +2982,13 @@
         <w:tblLook w:val="0000" w:firstRow="0" w:lastRow="0" w:firstColumn="0" w:lastColumn="0" w:noHBand="0" w:noVBand="0"/>
       </w:tblPr>
       <w:tblGrid>
-        <w:gridCol w:w="134"/>
-        <w:gridCol w:w="24"/>
-        <w:gridCol w:w="1509"/>
-        <w:gridCol w:w="1985"/>
-        <w:gridCol w:w="1151"/>
-        <w:gridCol w:w="28"/>
-        <w:gridCol w:w="27"/>
-        <w:gridCol w:w="35"/>
-        <w:gridCol w:w="27"/>
-        <w:gridCol w:w="128"/>
-        <w:gridCol w:w="1668"/>
-        <w:gridCol w:w="1589"/>
-        <w:gridCol w:w="1589"/>
+        <w:gridCol w:w="158"/>
+        <w:gridCol w:w="25"/>
+        <w:gridCol w:w="1753"/>
+        <w:gridCol w:w="2320"/>
+        <w:gridCol w:w="1942"/>
+        <w:gridCol w:w="1848"/>
+        <w:gridCol w:w="1848"/>
       </w:tblGrid>
       <w:tr>
         <w:trPr>
@@ -3002,7 +2996,7 @@
         </w:trPr>
         <w:tc>
           <w:tcPr>
-            <w:tcW w:w="68" w:type="pct"/>
+            <w:tcW w:w="79" w:type="pct"/>
             <w:tcBorders>
               <w:top w:val="single" w:sz="4" w:space="0" w:color="FFFFFF" w:themeColor="background1"/>
               <w:left w:val="single" w:sz="4" w:space="0" w:color="FFFFFF" w:themeColor="background1"/>
@@ -3024,7 +3018,7 @@
         </w:tc>
         <w:tc>
           <w:tcPr>
-            <w:tcW w:w="12" w:type="pct"/>
+            <w:tcW w:w="14" w:type="pct"/>
             <w:tcBorders>
               <w:top w:val="single" w:sz="1" w:space="0" w:color="BFBFBF"/>
               <w:left w:val="single" w:sz="1" w:space="0" w:color="BFBFBF"/>
@@ -3047,7 +3041,7 @@
         </w:tc>
         <w:tc>
           <w:tcPr>
-            <w:tcW w:w="763" w:type="pct"/>
+            <w:tcW w:w="888" w:type="pct"/>
             <w:tcBorders>
               <w:top w:val="single" w:sz="1" w:space="0" w:color="BFBFBF"/>
               <w:left w:val="single" w:sz="1" w:space="0" w:color="BFBFBF"/>
@@ -3077,7 +3071,7 @@
         </w:tc>
         <w:tc>
           <w:tcPr>
-            <w:tcW w:w="301" w:type="pct"/>
+            <w:tcW w:w="1168" w:type="pct"/>
             <w:tcBorders>
               <w:top w:val="single" w:sz="1" w:space="0" w:color="BFBFBF"/>
               <w:left w:val="single" w:sz="1" w:space="0" w:color="BFBFBF"/>
@@ -3107,8 +3101,7 @@
         </w:tc>
         <w:tc>
           <w:tcPr>
-            <w:tcW w:w="1407" w:type="pct"/>
-            <w:gridSpan w:val="6"/>
+            <w:tcW w:w="981" w:type="pct"/>
             <w:tcBorders>
               <w:top w:val="single" w:sz="1" w:space="0" w:color="BFBFBF"/>
               <w:left w:val="single" w:sz="1" w:space="0" w:color="BFBFBF"/>
@@ -3116,9 +3109,15 @@
               <w:right w:val="single" w:sz="1" w:space="0" w:color="BFBFBF"/>
             </w:tcBorders>
             <w:shd w:val="clear" w:color="auto" w:fill="1F4E79"/>
-          </w:tcPr>
-          <w:p>
-            <w:pPr>
+            <w:tcMar>
+              <w:top w:w="70" w:type="dxa"/>
+              <w:left w:w="120" w:type="dxa"/>
+              <w:bottom w:w="70" w:type="dxa"/>
+              <w:right w:w="120" w:type="dxa"/>
+            </w:tcMar>
+          </w:tcPr>
+          <w:p>
+            <w:r>
               <w:rPr>
                 <w:b/>
                 <w:bCs/>
@@ -3126,7 +3125,8 @@
                 <w:sz w:val="18"/>
                 <w:szCs w:val="18"/>
               </w:rPr>
-            </w:pPr>
+              <w:t>L</w:t>
+            </w:r>
             <w:r>
               <w:rPr>
                 <w:b/>
@@ -3135,13 +3135,13 @@
                 <w:sz w:val="18"/>
                 <w:szCs w:val="18"/>
               </w:rPr>
-              <w:t>Flags</w:t>
-            </w:r>
-          </w:p>
-        </w:tc>
-        <w:tc>
-          <w:tcPr>
-            <w:tcW w:w="843" w:type="pct"/>
+              <w:t>ength</w:t>
+            </w:r>
+          </w:p>
+        </w:tc>
+        <w:tc>
+          <w:tcPr>
+            <w:tcW w:w="935" w:type="pct"/>
             <w:tcBorders>
               <w:top w:val="single" w:sz="1" w:space="0" w:color="BFBFBF"/>
               <w:left w:val="single" w:sz="1" w:space="0" w:color="BFBFBF"/>
@@ -3165,8 +3165,28 @@
                 <w:sz w:val="18"/>
                 <w:szCs w:val="18"/>
               </w:rPr>
-              <w:t>L</w:t>
-            </w:r>
+              <w:t>Flags</w:t>
+            </w:r>
+          </w:p>
+        </w:tc>
+        <w:tc>
+          <w:tcPr>
+            <w:tcW w:w="935" w:type="pct"/>
+            <w:tcBorders>
+              <w:top w:val="single" w:sz="1" w:space="0" w:color="BFBFBF"/>
+              <w:left w:val="single" w:sz="1" w:space="0" w:color="BFBFBF"/>
+              <w:bottom w:val="single" w:sz="1" w:space="0" w:color="BFBFBF"/>
+              <w:right w:val="single" w:sz="1" w:space="0" w:color="BFBFBF"/>
+            </w:tcBorders>
+            <w:shd w:val="clear" w:color="auto" w:fill="1F4E79"/>
+            <w:tcMar>
+              <w:top w:w="70" w:type="dxa"/>
+              <w:left w:w="120" w:type="dxa"/>
+              <w:bottom w:w="70" w:type="dxa"/>
+              <w:right w:w="120" w:type="dxa"/>
+            </w:tcMar>
+          </w:tcPr>
+          <w:p>
             <w:r>
               <w:rPr>
                 <w:b/>
@@ -3175,66 +3195,6 @@
                 <w:sz w:val="18"/>
                 <w:szCs w:val="18"/>
               </w:rPr>
-              <w:t>ength</w:t>
-            </w:r>
-          </w:p>
-        </w:tc>
-        <w:tc>
-          <w:tcPr>
-            <w:tcW w:w="803" w:type="pct"/>
-            <w:tcBorders>
-              <w:top w:val="single" w:sz="1" w:space="0" w:color="BFBFBF"/>
-              <w:left w:val="single" w:sz="1" w:space="0" w:color="BFBFBF"/>
-              <w:bottom w:val="single" w:sz="1" w:space="0" w:color="BFBFBF"/>
-              <w:right w:val="single" w:sz="1" w:space="0" w:color="BFBFBF"/>
-            </w:tcBorders>
-            <w:shd w:val="clear" w:color="auto" w:fill="1F4E79"/>
-            <w:tcMar>
-              <w:top w:w="70" w:type="dxa"/>
-              <w:left w:w="120" w:type="dxa"/>
-              <w:bottom w:w="70" w:type="dxa"/>
-              <w:right w:w="120" w:type="dxa"/>
-            </w:tcMar>
-          </w:tcPr>
-          <w:p>
-            <w:r>
-              <w:rPr>
-                <w:b/>
-                <w:bCs/>
-                <w:color w:val="FFFFFF"/>
-                <w:sz w:val="18"/>
-                <w:szCs w:val="18"/>
-              </w:rPr>
-              <w:t>Flags</w:t>
-            </w:r>
-          </w:p>
-        </w:tc>
-        <w:tc>
-          <w:tcPr>
-            <w:tcW w:w="803" w:type="pct"/>
-            <w:tcBorders>
-              <w:top w:val="single" w:sz="1" w:space="0" w:color="BFBFBF"/>
-              <w:left w:val="single" w:sz="1" w:space="0" w:color="BFBFBF"/>
-              <w:bottom w:val="single" w:sz="1" w:space="0" w:color="BFBFBF"/>
-              <w:right w:val="single" w:sz="1" w:space="0" w:color="BFBFBF"/>
-            </w:tcBorders>
-            <w:shd w:val="clear" w:color="auto" w:fill="1F4E79"/>
-            <w:tcMar>
-              <w:top w:w="70" w:type="dxa"/>
-              <w:left w:w="120" w:type="dxa"/>
-              <w:bottom w:w="70" w:type="dxa"/>
-              <w:right w:w="120" w:type="dxa"/>
-            </w:tcMar>
-          </w:tcPr>
-          <w:p>
-            <w:r>
-              <w:rPr>
-                <w:b/>
-                <w:bCs/>
-                <w:color w:val="FFFFFF"/>
-                <w:sz w:val="18"/>
-                <w:szCs w:val="18"/>
-              </w:rPr>
               <w:t>Label</w:t>
             </w:r>
           </w:p>
@@ -3243,7 +3203,7 @@
       <w:tr>
         <w:tc>
           <w:tcPr>
-            <w:tcW w:w="68" w:type="pct"/>
+            <w:tcW w:w="79" w:type="pct"/>
             <w:tcBorders>
               <w:top w:val="single" w:sz="4" w:space="0" w:color="FFFFFF" w:themeColor="background1"/>
               <w:left w:val="single" w:sz="4" w:space="0" w:color="FFFFFF" w:themeColor="background1"/>
@@ -3273,7 +3233,7 @@
         </w:tc>
         <w:tc>
           <w:tcPr>
-            <w:tcW w:w="12" w:type="pct"/>
+            <w:tcW w:w="14" w:type="pct"/>
             <w:tcBorders>
               <w:top w:val="single" w:sz="1" w:space="0" w:color="BFBFBF"/>
               <w:left w:val="single" w:sz="1" w:space="0" w:color="BFBFBF"/>
@@ -3294,7 +3254,7 @@
         </w:tc>
         <w:tc>
           <w:tcPr>
-            <w:tcW w:w="763" w:type="pct"/>
+            <w:tcW w:w="888" w:type="pct"/>
             <w:tcBorders>
               <w:top w:val="single" w:sz="1" w:space="0" w:color="BFBFBF"/>
               <w:left w:val="single" w:sz="1" w:space="0" w:color="BFBFBF"/>
@@ -3322,7 +3282,7 @@
         </w:tc>
         <w:tc>
           <w:tcPr>
-            <w:tcW w:w="301" w:type="pct"/>
+            <w:tcW w:w="1168" w:type="pct"/>
             <w:tcBorders>
               <w:top w:val="single" w:sz="1" w:space="0" w:color="BFBFBF"/>
               <w:left w:val="single" w:sz="1" w:space="0" w:color="BFBFBF"/>
@@ -3350,24 +3310,49 @@
         </w:tc>
         <w:tc>
           <w:tcPr>
-            <w:tcW w:w="1407" w:type="pct"/>
-            <w:gridSpan w:val="6"/>
+            <w:tcW w:w="981" w:type="pct"/>
             <w:tcBorders>
               <w:top w:val="single" w:sz="1" w:space="0" w:color="BFBFBF"/>
               <w:left w:val="single" w:sz="1" w:space="0" w:color="BFBFBF"/>
               <w:bottom w:val="single" w:sz="4" w:space="0" w:color="BFBFBF"/>
               <w:right w:val="single" w:sz="1" w:space="0" w:color="BFBFBF"/>
             </w:tcBorders>
-          </w:tcPr>
-          <w:p>
-            <w:pPr>
-              <w:rPr>
-                <w:rFonts w:ascii="Courier New" w:eastAsia="Courier New" w:hAnsi="Courier New" w:cs="Courier New"/>
-                <w:color w:val="595959"/>
-                <w:sz w:val="18"/>
-                <w:szCs w:val="18"/>
-              </w:rPr>
-            </w:pPr>
+            <w:tcMar>
+              <w:top w:w="70" w:type="dxa"/>
+              <w:left w:w="120" w:type="dxa"/>
+              <w:bottom w:w="70" w:type="dxa"/>
+              <w:right w:w="120" w:type="dxa"/>
+            </w:tcMar>
+          </w:tcPr>
+          <w:p>
+            <w:r>
+              <w:rPr>
+                <w:rFonts w:ascii="Courier New" w:eastAsia="Courier New" w:hAnsi="Courier New" w:cs="Courier New"/>
+                <w:color w:val="595959"/>
+                <w:sz w:val="18"/>
+                <w:szCs w:val="18"/>
+              </w:rPr>
+              <w:t>{{ field.length }}</w:t>
+            </w:r>
+          </w:p>
+        </w:tc>
+        <w:tc>
+          <w:tcPr>
+            <w:tcW w:w="935" w:type="pct"/>
+            <w:tcBorders>
+              <w:top w:val="single" w:sz="1" w:space="0" w:color="BFBFBF"/>
+              <w:left w:val="single" w:sz="1" w:space="0" w:color="BFBFBF"/>
+              <w:bottom w:val="single" w:sz="4" w:space="0" w:color="BFBFBF"/>
+              <w:right w:val="single" w:sz="1" w:space="0" w:color="BFBFBF"/>
+            </w:tcBorders>
+            <w:tcMar>
+              <w:top w:w="70" w:type="dxa"/>
+              <w:left w:w="120" w:type="dxa"/>
+              <w:bottom w:w="70" w:type="dxa"/>
+              <w:right w:w="120" w:type="dxa"/>
+            </w:tcMar>
+          </w:tcPr>
+          <w:p>
             <w:r>
               <w:rPr>
                 <w:rFonts w:ascii="Courier New" w:eastAsia="Courier New" w:hAnsi="Courier New" w:cs="Courier New"/>
@@ -3381,63 +3366,7 @@
         </w:tc>
         <w:tc>
           <w:tcPr>
-            <w:tcW w:w="843" w:type="pct"/>
-            <w:tcBorders>
-              <w:top w:val="single" w:sz="1" w:space="0" w:color="BFBFBF"/>
-              <w:left w:val="single" w:sz="1" w:space="0" w:color="BFBFBF"/>
-              <w:bottom w:val="single" w:sz="4" w:space="0" w:color="BFBFBF"/>
-              <w:right w:val="single" w:sz="1" w:space="0" w:color="BFBFBF"/>
-            </w:tcBorders>
-            <w:tcMar>
-              <w:top w:w="70" w:type="dxa"/>
-              <w:left w:w="120" w:type="dxa"/>
-              <w:bottom w:w="70" w:type="dxa"/>
-              <w:right w:w="120" w:type="dxa"/>
-            </w:tcMar>
-          </w:tcPr>
-          <w:p>
-            <w:r>
-              <w:rPr>
-                <w:rFonts w:ascii="Courier New" w:eastAsia="Courier New" w:hAnsi="Courier New" w:cs="Courier New"/>
-                <w:color w:val="595959"/>
-                <w:sz w:val="18"/>
-                <w:szCs w:val="18"/>
-              </w:rPr>
-              <w:t>{{ field.length }}</w:t>
-            </w:r>
-          </w:p>
-        </w:tc>
-        <w:tc>
-          <w:tcPr>
-            <w:tcW w:w="803" w:type="pct"/>
-            <w:tcBorders>
-              <w:top w:val="single" w:sz="1" w:space="0" w:color="BFBFBF"/>
-              <w:left w:val="single" w:sz="1" w:space="0" w:color="BFBFBF"/>
-              <w:bottom w:val="single" w:sz="4" w:space="0" w:color="BFBFBF"/>
-              <w:right w:val="single" w:sz="1" w:space="0" w:color="BFBFBF"/>
-            </w:tcBorders>
-            <w:tcMar>
-              <w:top w:w="70" w:type="dxa"/>
-              <w:left w:w="120" w:type="dxa"/>
-              <w:bottom w:w="70" w:type="dxa"/>
-              <w:right w:w="120" w:type="dxa"/>
-            </w:tcMar>
-          </w:tcPr>
-          <w:p>
-            <w:r>
-              <w:rPr>
-                <w:rFonts w:ascii="Courier New" w:eastAsia="Courier New" w:hAnsi="Courier New" w:cs="Courier New"/>
-                <w:color w:val="595959"/>
-                <w:sz w:val="18"/>
-                <w:szCs w:val="18"/>
-              </w:rPr>
-              <w:t>{{ field.flags }}</w:t>
-            </w:r>
-          </w:p>
-        </w:tc>
-        <w:tc>
-          <w:tcPr>
-            <w:tcW w:w="803" w:type="pct"/>
+            <w:tcW w:w="935" w:type="pct"/>
             <w:tcBorders>
               <w:top w:val="single" w:sz="1" w:space="0" w:color="BFBFBF"/>
               <w:left w:val="single" w:sz="1" w:space="0" w:color="BFBFBF"/>
@@ -3475,7 +3404,7 @@
       <w:tr>
         <w:tc>
           <w:tcPr>
-            <w:tcW w:w="68" w:type="pct"/>
+            <w:tcW w:w="79" w:type="pct"/>
             <w:tcBorders>
               <w:top w:val="single" w:sz="4" w:space="0" w:color="FFFFFF" w:themeColor="background1"/>
               <w:left w:val="nil"/>
@@ -3505,7 +3434,7 @@
         </w:tc>
         <w:tc>
           <w:tcPr>
-            <w:tcW w:w="12" w:type="pct"/>
+            <w:tcW w:w="14" w:type="pct"/>
             <w:tcBorders>
               <w:top w:val="single" w:sz="4" w:space="0" w:color="BFBFBF"/>
               <w:left w:val="nil"/>
@@ -3526,7 +3455,7 @@
         </w:tc>
         <w:tc>
           <w:tcPr>
-            <w:tcW w:w="763" w:type="pct"/>
+            <w:tcW w:w="888" w:type="pct"/>
             <w:tcBorders>
               <w:top w:val="single" w:sz="4" w:space="0" w:color="BFBFBF"/>
               <w:left w:val="nil"/>
@@ -3553,7 +3482,7 @@
         </w:tc>
         <w:tc>
           <w:tcPr>
-            <w:tcW w:w="301" w:type="pct"/>
+            <w:tcW w:w="1168" w:type="pct"/>
             <w:tcBorders>
               <w:top w:val="single" w:sz="4" w:space="0" w:color="BFBFBF"/>
               <w:left w:val="nil"/>
@@ -3580,13 +3509,19 @@
         </w:tc>
         <w:tc>
           <w:tcPr>
-            <w:tcW w:w="1182" w:type="pct"/>
+            <w:tcW w:w="981" w:type="pct"/>
             <w:tcBorders>
               <w:top w:val="single" w:sz="4" w:space="0" w:color="BFBFBF"/>
               <w:left w:val="nil"/>
               <w:bottom w:val="nil"/>
               <w:right w:val="nil"/>
             </w:tcBorders>
+            <w:tcMar>
+              <w:top w:w="70" w:type="dxa"/>
+              <w:left w:w="120" w:type="dxa"/>
+              <w:bottom w:w="70" w:type="dxa"/>
+              <w:right w:w="120" w:type="dxa"/>
+            </w:tcMar>
           </w:tcPr>
           <w:p>
             <w:pPr>
@@ -3601,13 +3536,19 @@
         </w:tc>
         <w:tc>
           <w:tcPr>
-            <w:tcW w:w="23" w:type="pct"/>
+            <w:tcW w:w="935" w:type="pct"/>
             <w:tcBorders>
               <w:top w:val="single" w:sz="4" w:space="0" w:color="BFBFBF"/>
               <w:left w:val="nil"/>
               <w:bottom w:val="nil"/>
               <w:right w:val="nil"/>
             </w:tcBorders>
+            <w:tcMar>
+              <w:top w:w="70" w:type="dxa"/>
+              <w:left w:w="120" w:type="dxa"/>
+              <w:bottom w:w="70" w:type="dxa"/>
+              <w:right w:w="120" w:type="dxa"/>
+            </w:tcMar>
           </w:tcPr>
           <w:p>
             <w:pPr>
@@ -3622,145 +3563,7 @@
         </w:tc>
         <w:tc>
           <w:tcPr>
-            <w:tcW w:w="22" w:type="pct"/>
-            <w:tcBorders>
-              <w:top w:val="single" w:sz="4" w:space="0" w:color="BFBFBF"/>
-              <w:left w:val="nil"/>
-              <w:bottom w:val="nil"/>
-              <w:right w:val="nil"/>
-            </w:tcBorders>
-          </w:tcPr>
-          <w:p>
-            <w:pPr>
-              <w:rPr>
-                <w:rFonts w:ascii="Courier New" w:eastAsia="Courier New" w:hAnsi="Courier New" w:cs="Courier New"/>
-                <w:color w:val="595959"/>
-                <w:sz w:val="18"/>
-                <w:szCs w:val="18"/>
-              </w:rPr>
-            </w:pPr>
-          </w:p>
-        </w:tc>
-        <w:tc>
-          <w:tcPr>
-            <w:tcW w:w="31" w:type="pct"/>
-            <w:tcBorders>
-              <w:top w:val="single" w:sz="4" w:space="0" w:color="BFBFBF"/>
-              <w:left w:val="nil"/>
-              <w:bottom w:val="nil"/>
-              <w:right w:val="nil"/>
-            </w:tcBorders>
-          </w:tcPr>
-          <w:p>
-            <w:pPr>
-              <w:rPr>
-                <w:rFonts w:ascii="Courier New" w:eastAsia="Courier New" w:hAnsi="Courier New" w:cs="Courier New"/>
-                <w:color w:val="595959"/>
-                <w:sz w:val="18"/>
-                <w:szCs w:val="18"/>
-              </w:rPr>
-            </w:pPr>
-          </w:p>
-        </w:tc>
-        <w:tc>
-          <w:tcPr>
-            <w:tcW w:w="22" w:type="pct"/>
-            <w:tcBorders>
-              <w:top w:val="single" w:sz="4" w:space="0" w:color="BFBFBF"/>
-              <w:left w:val="nil"/>
-              <w:bottom w:val="nil"/>
-              <w:right w:val="nil"/>
-            </w:tcBorders>
-          </w:tcPr>
-          <w:p>
-            <w:pPr>
-              <w:rPr>
-                <w:rFonts w:ascii="Courier New" w:eastAsia="Courier New" w:hAnsi="Courier New" w:cs="Courier New"/>
-                <w:color w:val="595959"/>
-                <w:sz w:val="18"/>
-                <w:szCs w:val="18"/>
-              </w:rPr>
-            </w:pPr>
-          </w:p>
-        </w:tc>
-        <w:tc>
-          <w:tcPr>
-            <w:tcW w:w="127" w:type="pct"/>
-            <w:tcBorders>
-              <w:top w:val="single" w:sz="4" w:space="0" w:color="BFBFBF"/>
-              <w:left w:val="nil"/>
-              <w:bottom w:val="nil"/>
-              <w:right w:val="nil"/>
-            </w:tcBorders>
-          </w:tcPr>
-          <w:p>
-            <w:pPr>
-              <w:rPr>
-                <w:rFonts w:ascii="Courier New" w:eastAsia="Courier New" w:hAnsi="Courier New" w:cs="Courier New"/>
-                <w:color w:val="595959"/>
-                <w:sz w:val="18"/>
-                <w:szCs w:val="18"/>
-              </w:rPr>
-            </w:pPr>
-          </w:p>
-        </w:tc>
-        <w:tc>
-          <w:tcPr>
-            <w:tcW w:w="843" w:type="pct"/>
-            <w:tcBorders>
-              <w:top w:val="single" w:sz="4" w:space="0" w:color="BFBFBF"/>
-              <w:left w:val="nil"/>
-              <w:bottom w:val="nil"/>
-              <w:right w:val="nil"/>
-            </w:tcBorders>
-            <w:tcMar>
-              <w:top w:w="70" w:type="dxa"/>
-              <w:left w:w="120" w:type="dxa"/>
-              <w:bottom w:w="70" w:type="dxa"/>
-              <w:right w:w="120" w:type="dxa"/>
-            </w:tcMar>
-          </w:tcPr>
-          <w:p>
-            <w:pPr>
-              <w:rPr>
-                <w:rFonts w:ascii="Courier New" w:eastAsia="Courier New" w:hAnsi="Courier New" w:cs="Courier New"/>
-                <w:color w:val="595959"/>
-                <w:sz w:val="18"/>
-                <w:szCs w:val="18"/>
-              </w:rPr>
-            </w:pPr>
-          </w:p>
-        </w:tc>
-        <w:tc>
-          <w:tcPr>
-            <w:tcW w:w="803" w:type="pct"/>
-            <w:tcBorders>
-              <w:top w:val="single" w:sz="4" w:space="0" w:color="BFBFBF"/>
-              <w:left w:val="nil"/>
-              <w:bottom w:val="nil"/>
-              <w:right w:val="nil"/>
-            </w:tcBorders>
-            <w:tcMar>
-              <w:top w:w="70" w:type="dxa"/>
-              <w:left w:w="120" w:type="dxa"/>
-              <w:bottom w:w="70" w:type="dxa"/>
-              <w:right w:w="120" w:type="dxa"/>
-            </w:tcMar>
-          </w:tcPr>
-          <w:p>
-            <w:pPr>
-              <w:rPr>
-                <w:rFonts w:ascii="Courier New" w:eastAsia="Courier New" w:hAnsi="Courier New" w:cs="Courier New"/>
-                <w:color w:val="595959"/>
-                <w:sz w:val="18"/>
-                <w:szCs w:val="18"/>
-              </w:rPr>
-            </w:pPr>
-          </w:p>
-        </w:tc>
-        <w:tc>
-          <w:tcPr>
-            <w:tcW w:w="803" w:type="pct"/>
+            <w:tcW w:w="935" w:type="pct"/>
             <w:tcBorders>
               <w:top w:val="single" w:sz="4" w:space="0" w:color="BFBFBF"/>
               <w:left w:val="nil"/>

</xml_diff>